<commit_message>
Reconcile EN↔KO reference lists: fix KO Yun entry, add Worm; full parity (33/33)
- Korean list cited 'Yun et al., 2022' but listed the wrong paper (Yun H.-W.,
  InSAR signatures); replace with Yun G. R. et al. (TanDEM-X Ganghwa DEM) to
  match the body context and the English list.
- Add Worm et al. (2006) to the Korean §1.1 ecosystem-services citation and the
  reference list (was EN-only).
- EN and KO reference lists now identical (33 entries, no mismatches).

Co-Authored-By: Claude Opus 4.8 (1M context) <noreply@anthropic.com>
</commit_message>
<xml_diff>
--- a/manuscript/draft_ko.docx
+++ b/manuscript/draft_ko.docx
@@ -674,7 +674,7 @@
         </m:sSup>
       </m:oMath>
       <w:r>
-        <w:t xml:space="preserve">로 추정되며(Murray et al., 2019), 탄소 격리, 어류·갑각류 서식지 제공, 해안 폭풍 완충 등 핵심 생태계 서비스를 담당한다. 그러나 이들 지역에 대한 디지털 표고 모델(DEM)은 현장 측량 비용과 접근성 제약으로 인해 대규모 일관 매핑이 어렵다. 항공 LiDAR가 가장 정확한 자료를 제공하지만 비용이 크고, 임무 단위로 단발적으로 운영된다. 위성 탑재 ICESat-2 레이저 고도계는 최근 조간대에서 반복 가능한 cm급 직접 표고 기준을 제공하지만, 성기고 불연속적인 지상 트랙으로 인해 단독 DEM 밀도는 제한적이다(Xu et al., 2022).</w:t>
+        <w:t xml:space="preserve">로 추정되며(Murray et al., 2019; Worm et al., 2006), 탄소 격리, 어류·갑각류 서식지 제공, 해안 폭풍 완충 등 핵심 생태계 서비스를 담당한다. 그러나 이들 지역에 대한 디지털 표고 모델(DEM)은 현장 측량 비용과 접근성 제약으로 인해 대규모 일관 매핑이 어렵다. 항공 LiDAR가 가장 정확한 자료를 제공하지만 비용이 크고, 임무 단위로 단발적으로 운영된다. 위성 탑재 ICESat-2 레이저 고도계는 최근 조간대에서 반복 가능한 cm급 직접 표고 기준을 제공하지만, 성기고 불연속적인 지상 트랙으로 인해 단독 DEM 밀도는 제한적이다(Xu et al., 2022).</w:t>
       </w:r>
     </w:p>
     <w:p>
@@ -15908,7 +15908,7 @@
         </w:numPr>
       </w:pPr>
       <w:r>
-        <w:t xml:space="preserve">Xin, H., Xu, N., Xu, H., Yang, H., Wang, Z., Zhang, Z., Ding, Y., Luan, H., Ou, Y., Yang, Y., 2025.</w:t>
+        <w:t xml:space="preserve">Worm, B., Barbier, E. B., Beaumont, N., Duffy, J. E., Folke, C., Halpern, B. S., Jackson, J. B. C., Lotze, H. K., Micheli, F., Palumbi, S. R., Sala, E., Selkoe, K. A., Stachowicz, J. J., Watson, R., 2006.</w:t>
       </w:r>
       <w:r>
         <w:t xml:space="preserve"> </w:t>
@@ -15918,13 +15918,13 @@
           <w:i/>
           <w:iCs/>
         </w:rPr>
-        <w:t xml:space="preserve">Mapping tidal flat topography by combining ICESat-2 laser altimetry and multi-source satellite imagery.</w:t>
-      </w:r>
-      <w:r>
-        <w:t xml:space="preserve"> </w:t>
-      </w:r>
-      <w:r>
-        <w:t xml:space="preserve">International Journal of Digital Earth 18 (2), 2554313. doi:10.1080/17538947.2025.2554313.</w:t>
+        <w:t xml:space="preserve">Impacts of biodiversity loss on ocean ecosystem services.</w:t>
+      </w:r>
+      <w:r>
+        <w:t xml:space="preserve"> </w:t>
+      </w:r>
+      <w:r>
+        <w:t xml:space="preserve">Science 314, 787–790. doi:10.1126/science.1132294.</w:t>
       </w:r>
     </w:p>
     <w:p>
@@ -15936,7 +15936,7 @@
         </w:numPr>
       </w:pPr>
       <w:r>
-        <w:t xml:space="preserve">Xu, N., Ma, Y., Yang, J., Wang, X. H., Wang, Y., Xu, R., 2022.</w:t>
+        <w:t xml:space="preserve">Xin, H., Xu, N., Xu, H., Yang, H., Wang, Z., Zhang, Z., Ding, Y., Luan, H., Ou, Y., Yang, Y., 2025.</w:t>
       </w:r>
       <w:r>
         <w:t xml:space="preserve"> </w:t>
@@ -15946,13 +15946,13 @@
           <w:i/>
           <w:iCs/>
         </w:rPr>
-        <w:t xml:space="preserve">Deriving tidal flat topography using ICESat-2 laser altimetry and Sentinel-2 imagery.</w:t>
-      </w:r>
-      <w:r>
-        <w:t xml:space="preserve"> </w:t>
-      </w:r>
-      <w:r>
-        <w:t xml:space="preserve">Geophysical Research Letters 49, e2021GL096813. doi:10.1029/2021GL096813.</w:t>
+        <w:t xml:space="preserve">Mapping tidal flat topography by combining ICESat-2 laser altimetry and multi-source satellite imagery.</w:t>
+      </w:r>
+      <w:r>
+        <w:t xml:space="preserve"> </w:t>
+      </w:r>
+      <w:r>
+        <w:t xml:space="preserve">International Journal of Digital Earth 18 (2), 2554313. doi:10.1080/17538947.2025.2554313.</w:t>
       </w:r>
     </w:p>
     <w:p>
@@ -15964,7 +15964,7 @@
         </w:numPr>
       </w:pPr>
       <w:r>
-        <w:t xml:space="preserve">Yun, H.-W., Kim, J.-R., Choi, Y.-S., Lin, S.-Y., 2022.</w:t>
+        <w:t xml:space="preserve">Xu, N., Ma, Y., Yang, J., Wang, X. H., Wang, Y., Xu, R., 2022.</w:t>
       </w:r>
       <w:r>
         <w:t xml:space="preserve"> </w:t>
@@ -15974,13 +15974,41 @@
           <w:i/>
           <w:iCs/>
         </w:rPr>
-        <w:t xml:space="preserve">Analyses of time series InSAR signatures for the Ganghwa tidal flat, Korea.</w:t>
-      </w:r>
-      <w:r>
-        <w:t xml:space="preserve"> </w:t>
-      </w:r>
-      <w:r>
-        <w:t xml:space="preserve">Remote Sensing 14, 4448. doi:10.3390/rs14184448.</w:t>
+        <w:t xml:space="preserve">Deriving tidal flat topography using ICESat-2 laser altimetry and Sentinel-2 imagery.</w:t>
+      </w:r>
+      <w:r>
+        <w:t xml:space="preserve"> </w:t>
+      </w:r>
+      <w:r>
+        <w:t xml:space="preserve">Geophysical Research Letters 49, e2021GL096813. doi:10.1029/2021GL096813.</w:t>
+      </w:r>
+    </w:p>
+    <w:p>
+      <w:pPr>
+        <w:pStyle w:val="Compact"/>
+        <w:numPr>
+          <w:ilvl w:val="0"/>
+          <w:numId w:val="1016"/>
+        </w:numPr>
+      </w:pPr>
+      <w:r>
+        <w:t xml:space="preserve">Yun, G. R., Ryu, J.-H., Kim, K. L., Lee, J. H., Lee, S.-K., 2022.</w:t>
+      </w:r>
+      <w:r>
+        <w:t xml:space="preserve"> </w:t>
+      </w:r>
+      <w:r>
+        <w:rPr>
+          <w:i/>
+          <w:iCs/>
+        </w:rPr>
+        <w:t xml:space="preserve">TanDEM-X-based Ganghwa tidal flat high-resolution topographic map construction and service.</w:t>
+      </w:r>
+      <w:r>
+        <w:t xml:space="preserve"> </w:t>
+      </w:r>
+      <w:r>
+        <w:t xml:space="preserve">GEO DATA 4 (1), 37–42. doi:10.22761/DJ2022.4.1.004.</w:t>
       </w:r>
     </w:p>
     <w:p>

</xml_diff>